<commit_message>
Run Watch Dog EM as a resilient Windows service
</commit_message>
<xml_diff>
--- a/Watch Dog EM - Complete DDC and Meter Commissioning Guide.docx
+++ b/Watch Dog EM - Complete DDC and Meter Commissioning Guide.docx
@@ -172,7 +172,7 @@
           <w:color w:val="5B6F7C"/>
           <w:sz w:val="17"/>
         </w:rPr>
-        <w:t>Prepared for installation and commissioning teams  •  Version 1.0  •  September 2026</w:t>
+        <w:t>Prepared for installation and commissioning teams  •  Updated for Watch Dog EM v1.4.0  •  September 2026</w:t>
       </w:r>
     </w:p>
     <w:p>
@@ -485,7 +485,7 @@
           </w:tcPr>
           <w:p>
             <w:r>
-              <w:t>Meter tariff, currency and effective date</w:t>
+              <w:t>Meter tariff, currency, publication day (1–7), and payment due days</w:t>
             </w:r>
           </w:p>
         </w:tc>
@@ -2062,7 +2062,7 @@
         <w:t xml:space="preserve">2.  Open Controller setup — </w:t>
       </w:r>
       <w:r>
-        <w:t>Select Controller setup in the top navigation, then choose Add controller.</w:t>
+        <w:t>Open Settings in the top navigation, select Controller setup, then choose Add controller.</w:t>
       </w:r>
     </w:p>
     <w:p>
@@ -3589,7 +3589,7 @@
         <w:t xml:space="preserve">2.  Check Dashboard — </w:t>
       </w:r>
       <w:r>
-        <w:t>Confirm the meter appears, the source badge is correct, and status becomes Connected.</w:t>
+        <w:t>Open Main → Dashboard. Confirm the meter appears, the source badge is correct, and status becomes Connected.</w:t>
       </w:r>
     </w:p>
     <w:p>
@@ -3604,7 +3604,7 @@
         <w:t xml:space="preserve">3.  Check the source page — </w:t>
       </w:r>
       <w:r>
-        <w:t>UMEME meters must appear only on UMEME; Generator meters only on Generator.</w:t>
+        <w:t>Open Main → UMEME or Generator. UMEME meters must appear only on UMEME; Generator meters only on Generator.</w:t>
       </w:r>
     </w:p>
     <w:p>
@@ -3932,7 +3932,7 @@
         <w:pStyle w:val="Heading2"/>
       </w:pPr>
       <w:r>
-        <w:t>Tariff</w:t>
+        <w:t>One-form tariff and invoice setup</w:t>
       </w:r>
     </w:p>
     <w:p>
@@ -3944,10 +3944,10 @@
           <w:b/>
           <w:color w:val="0A2A3A"/>
         </w:rPr>
-        <w:t xml:space="preserve">1.  Open Operations — </w:t>
+        <w:t xml:space="preserve">1.  Open the settings — </w:t>
       </w:r>
       <w:r>
-        <w:t>Go to Meter-specific tariff history.</w:t>
+        <w:t>Open Main → Operations, then use Tariffs &amp; invoice day. The long Meter register is folded by default; select its arrow only when you need to view it.</w:t>
       </w:r>
     </w:p>
     <w:p>
@@ -3962,7 +3962,7 @@
         <w:t xml:space="preserve">2.  Select the meter — </w:t>
       </w:r>
       <w:r>
-        <w:t>Tariffs are independent; Shop 1 and Shop 2 can have different prices.</w:t>
+        <w:t>Tariffs remain independent. Each shop or meter can have its own price and currency.</w:t>
       </w:r>
     </w:p>
     <w:p>
@@ -3974,10 +3974,10 @@
           <w:b/>
           <w:color w:val="0A2A3A"/>
         </w:rPr>
-        <w:t xml:space="preserve">3.  Enter price and currency — </w:t>
+        <w:t xml:space="preserve">3.  Enter tariff and currency — </w:t>
       </w:r>
       <w:r>
-        <w:t>Choose the correct ISO currency, such as UGX or USD.</w:t>
+        <w:t>The tariff starts immediately when the combined form is saved. Choose the correct ISO currency, such as UGX or USD.</w:t>
       </w:r>
     </w:p>
     <w:p>
@@ -3989,10 +3989,10 @@
           <w:b/>
           <w:color w:val="0A2A3A"/>
         </w:rPr>
-        <w:t xml:space="preserve">4.  Set effective date/time — </w:t>
+        <w:t xml:space="preserve">4.  Choose publication day — </w:t>
       </w:r>
       <w:r>
-        <w:t>This is when the tariff begins. It is not the invoice publication date.</w:t>
+        <w:t>Select one recurring day from 1 through 7. The system publishes invoices shortly after midnight on that day every month.</w:t>
       </w:r>
     </w:p>
     <w:p>
@@ -4004,23 +4004,83 @@
           <w:b/>
           <w:color w:val="0A2A3A"/>
         </w:rPr>
-        <w:t xml:space="preserve">5.  Confirm tariff — </w:t>
+        <w:t xml:space="preserve">5.  Set payment terms — </w:t>
       </w:r>
       <w:r>
-        <w:t>Review the history so the correct rate applies to the intended billing period.</w:t>
+        <w:t>Enter how many days after publication the invoice becomes due.</w:t>
       </w:r>
+    </w:p>
+    <w:p>
+      <w:pPr>
+        <w:pStyle w:val="GuideNumber"/>
+      </w:pPr>
+      <w:r>
+        <w:rPr>
+          <w:b/>
+          <w:color w:val="0A2A3A"/>
+        </w:rPr>
+        <w:t xml:space="preserve">6.  Save everything — </w:t>
+      </w:r>
+      <w:r>
+        <w:t>Select Save all settings. One action saves the meter tariff, currency, monthly publication day, due days and optional reason.</w:t>
+      </w:r>
+    </w:p>
+    <w:tbl>
+      <w:tblPr>
+        <w:tblW w:type="auto" w:w="0"/>
+        <w:jc w:val="center"/>
+        <w:tblLook w:firstColumn="1" w:firstRow="1" w:lastColumn="0" w:lastRow="0" w:noHBand="0" w:noVBand="1" w:val="04A0"/>
+      </w:tblPr>
+      <w:tblGrid>
+        <w:gridCol w:w="9994"/>
+      </w:tblGrid>
+      <w:tr>
+        <w:tc>
+          <w:tcPr>
+            <w:tcW w:type="dxa" w:w="9994"/>
+            <w:shd w:fill="E8EEF5"/>
+            <w:tcMar>
+              <w:top w:w="120" w:type="dxa"/>
+              <w:start w:w="160" w:type="dxa"/>
+              <w:bottom w:w="120" w:type="dxa"/>
+              <w:end w:w="160" w:type="dxa"/>
+            </w:tcMar>
+          </w:tcPr>
+          <w:p>
+            <w:pPr>
+              <w:spacing w:after="40"/>
+            </w:pPr>
+            <w:r>
+              <w:rPr>
+                <w:b/>
+                <w:color w:val="2E74B5"/>
+              </w:rPr>
+              <w:t>How the monthly run works</w:t>
+            </w:r>
+            <w:r>
+              <w:br/>
+              <w:t>On the selected publication day, Watch Dog EM calculates and publishes invoices for the previous completed calendar month. Keep the application running. Previous tariff and schedule changes are shown only in Settings → Audit trail.</w:t>
+            </w:r>
+          </w:p>
+        </w:tc>
+      </w:tr>
+    </w:tbl>
+    <w:p>
+      <w:pPr>
+        <w:spacing w:after="0"/>
+      </w:pPr>
     </w:p>
     <w:p>
       <w:pPr>
         <w:pStyle w:val="Heading2"/>
       </w:pPr>
       <w:r>
-        <w:t>Invoice period</w:t>
+        <w:t>Find published invoices</w:t>
       </w:r>
     </w:p>
     <w:p>
       <w:r>
-        <w:t>Use Billing operations to select the individual shop/meter and the flexible period start and end dates. Review the opening/closing readings and consumption before finalizing. Generate draft invoices first; finalize only after verification.</w:t>
+        <w:t>Open Main → Published invoices. Every finalized invoice is retained there. Use the search banner to find records by day, month, year, invoice number, shop, tenant or meter, then select View / PDF.</w:t>
       </w:r>
     </w:p>
     <w:tbl>
@@ -5419,7 +5479,7 @@
         <w:t xml:space="preserve">•  </w:t>
       </w:r>
       <w:r>
-        <w:t>☐ Tariff, currency and effective date are correct for each meter.</w:t>
+        <w:t>☐ Tariff, currency, publication day (1–7), and payment due days are correct; Save all settings was completed.</w:t>
       </w:r>
     </w:p>
     <w:p>

</xml_diff>